<commit_message>
docs: actualizar bloque de autores IEEE en 3 columnas segun captura de pantalla
</commit_message>
<xml_diff>
--- a/Docs/Articulo_IEEE_KinectStrike_Waypoints_FisicaPredictiva_Kinect.docx
+++ b/Docs/Articulo_IEEE_KinectStrike_Waypoints_FisicaPredictiva_Kinect.docx
@@ -21,82 +21,275 @@
     </w:p>
     <w:p>
       <w:pPr>
-        <w:spacing w:before="0" w:after="0" w:line="240" w:lineRule="auto"/>
+        <w:spacing w:before="0" w:after="80" w:line="240" w:lineRule="auto"/>
         <w:ind w:firstLine="0" w:left="0"/>
         <w:jc w:val="center"/>
       </w:pPr>
     </w:p>
+    <w:tbl>
+      <w:tblPr>
+        <w:tblW w:type="dxa" w:w="10440"/>
+        <w:tblLook w:firstColumn="1" w:firstRow="1" w:lastColumn="0" w:lastRow="0" w:noHBand="0" w:noVBand="1" w:val="04A0"/>
+        <w:tblBorders>
+          <w:top w:val="nil" w:sz="0" w:space="0" w:color="000000"/>
+          <w:left w:val="nil" w:sz="0" w:space="0" w:color="000000"/>
+          <w:bottom w:val="nil" w:sz="0" w:space="0" w:color="000000"/>
+          <w:right w:val="nil" w:sz="0" w:space="0" w:color="000000"/>
+          <w:insideH w:val="nil" w:sz="0" w:space="0" w:color="000000"/>
+          <w:insideV w:val="nil" w:sz="0" w:space="0" w:color="000000"/>
+        </w:tblBorders>
+      </w:tblPr>
+      <w:tblGrid>
+        <w:gridCol w:w="3480"/>
+        <w:gridCol w:w="3480"/>
+        <w:gridCol w:w="3480"/>
+      </w:tblGrid>
+      <w:tr>
+        <w:tc>
+          <w:tcPr>
+            <w:tcW w:type="dxa" w:w="3480"/>
+          </w:tcPr>
+          <w:p>
+            <w:pPr>
+              <w:spacing w:before="80" w:after="40" w:line="240" w:lineRule="auto"/>
+              <w:ind w:firstLine="0" w:left="0"/>
+              <w:jc w:val="center"/>
+            </w:pPr>
+            <w:r>
+              <w:rPr>
+                <w:rFonts w:ascii="Times New Roman" w:hAnsi="Times New Roman" w:eastAsia="Times New Roman" w:cs="Times New Roman"/>
+                <w:b/>
+                <w:sz w:val="20"/>
+              </w:rPr>
+              <w:t>Kevin Joel Callo Ccagiavilca</w:t>
+            </w:r>
+          </w:p>
+          <w:p>
+            <w:pPr>
+              <w:spacing w:before="0" w:after="20" w:line="240" w:lineRule="auto"/>
+              <w:ind w:firstLine="0" w:left="0"/>
+              <w:jc w:val="center"/>
+            </w:pPr>
+            <w:r>
+              <w:rPr>
+                <w:rFonts w:ascii="Times New Roman" w:hAnsi="Times New Roman" w:eastAsia="Times New Roman" w:cs="Times New Roman"/>
+                <w:i/>
+                <w:sz w:val="19"/>
+              </w:rPr>
+              <w:t>Escuela Profesional de Ingeniería de Sistemas</w:t>
+            </w:r>
+          </w:p>
+          <w:p>
+            <w:pPr>
+              <w:spacing w:before="0" w:after="20" w:line="240" w:lineRule="auto"/>
+              <w:ind w:firstLine="0" w:left="0"/>
+              <w:jc w:val="center"/>
+            </w:pPr>
+            <w:r>
+              <w:rPr>
+                <w:rFonts w:ascii="Times New Roman" w:hAnsi="Times New Roman" w:eastAsia="Times New Roman" w:cs="Times New Roman"/>
+                <w:i/>
+                <w:sz w:val="19"/>
+              </w:rPr>
+              <w:t>Universidad Nacional de San Agustín de Arequipa</w:t>
+            </w:r>
+          </w:p>
+          <w:p>
+            <w:pPr>
+              <w:spacing w:before="0" w:after="20" w:line="240" w:lineRule="auto"/>
+              <w:ind w:firstLine="0" w:left="0"/>
+              <w:jc w:val="center"/>
+            </w:pPr>
+            <w:r>
+              <w:rPr>
+                <w:rFonts w:ascii="Times New Roman" w:hAnsi="Times New Roman" w:eastAsia="Times New Roman" w:cs="Times New Roman"/>
+                <w:i w:val="0"/>
+                <w:sz w:val="19"/>
+              </w:rPr>
+              <w:t>Arequipa, Perú</w:t>
+            </w:r>
+          </w:p>
+          <w:p>
+            <w:pPr>
+              <w:spacing w:before="0" w:after="20" w:line="240" w:lineRule="auto"/>
+              <w:ind w:firstLine="0" w:left="0"/>
+              <w:jc w:val="center"/>
+            </w:pPr>
+            <w:r>
+              <w:rPr>
+                <w:rFonts w:ascii="Times New Roman" w:hAnsi="Times New Roman" w:eastAsia="Times New Roman" w:cs="Times New Roman"/>
+                <w:i w:val="0"/>
+                <w:sz w:val="19"/>
+              </w:rPr>
+              <w:t>kcalloc@unsa.edu.pe</w:t>
+            </w:r>
+          </w:p>
+        </w:tc>
+        <w:tc>
+          <w:tcPr>
+            <w:tcW w:type="dxa" w:w="3480"/>
+          </w:tcPr>
+          <w:p>
+            <w:pPr>
+              <w:spacing w:before="80" w:after="40" w:line="240" w:lineRule="auto"/>
+              <w:ind w:firstLine="0" w:left="0"/>
+              <w:jc w:val="center"/>
+            </w:pPr>
+            <w:r>
+              <w:rPr>
+                <w:rFonts w:ascii="Times New Roman" w:hAnsi="Times New Roman" w:eastAsia="Times New Roman" w:cs="Times New Roman"/>
+                <w:b/>
+                <w:sz w:val="20"/>
+              </w:rPr>
+              <w:t>Marco Antonio Marquez Herrera</w:t>
+            </w:r>
+          </w:p>
+          <w:p>
+            <w:pPr>
+              <w:spacing w:before="0" w:after="20" w:line="240" w:lineRule="auto"/>
+              <w:ind w:firstLine="0" w:left="0"/>
+              <w:jc w:val="center"/>
+            </w:pPr>
+            <w:r>
+              <w:rPr>
+                <w:rFonts w:ascii="Times New Roman" w:hAnsi="Times New Roman" w:eastAsia="Times New Roman" w:cs="Times New Roman"/>
+                <w:i/>
+                <w:sz w:val="19"/>
+              </w:rPr>
+              <w:t>Escuela Profesional de Ingeniería de Sistemas</w:t>
+            </w:r>
+          </w:p>
+          <w:p>
+            <w:pPr>
+              <w:spacing w:before="0" w:after="20" w:line="240" w:lineRule="auto"/>
+              <w:ind w:firstLine="0" w:left="0"/>
+              <w:jc w:val="center"/>
+            </w:pPr>
+            <w:r>
+              <w:rPr>
+                <w:rFonts w:ascii="Times New Roman" w:hAnsi="Times New Roman" w:eastAsia="Times New Roman" w:cs="Times New Roman"/>
+                <w:i/>
+                <w:sz w:val="19"/>
+              </w:rPr>
+              <w:t>Universidad Nacional de San Agustín de Arequipa</w:t>
+            </w:r>
+          </w:p>
+          <w:p>
+            <w:pPr>
+              <w:spacing w:before="0" w:after="20" w:line="240" w:lineRule="auto"/>
+              <w:ind w:firstLine="0" w:left="0"/>
+              <w:jc w:val="center"/>
+            </w:pPr>
+            <w:r>
+              <w:rPr>
+                <w:rFonts w:ascii="Times New Roman" w:hAnsi="Times New Roman" w:eastAsia="Times New Roman" w:cs="Times New Roman"/>
+                <w:i w:val="0"/>
+                <w:sz w:val="19"/>
+              </w:rPr>
+              <w:t>Arequipa, Perú</w:t>
+            </w:r>
+          </w:p>
+          <w:p>
+            <w:pPr>
+              <w:spacing w:before="0" w:after="20" w:line="240" w:lineRule="auto"/>
+              <w:ind w:firstLine="0" w:left="0"/>
+              <w:jc w:val="center"/>
+            </w:pPr>
+            <w:r>
+              <w:rPr>
+                <w:rFonts w:ascii="Times New Roman" w:hAnsi="Times New Roman" w:eastAsia="Times New Roman" w:cs="Times New Roman"/>
+                <w:i w:val="0"/>
+                <w:sz w:val="19"/>
+              </w:rPr>
+              <w:t>mmarquezhe@unsa.edu.pe</w:t>
+            </w:r>
+          </w:p>
+        </w:tc>
+        <w:tc>
+          <w:tcPr>
+            <w:tcW w:type="dxa" w:w="3480"/>
+          </w:tcPr>
+          <w:p>
+            <w:pPr>
+              <w:spacing w:before="80" w:after="40" w:line="240" w:lineRule="auto"/>
+              <w:ind w:firstLine="0" w:left="0"/>
+              <w:jc w:val="center"/>
+            </w:pPr>
+            <w:r>
+              <w:rPr>
+                <w:rFonts w:ascii="Times New Roman" w:hAnsi="Times New Roman" w:eastAsia="Times New Roman" w:cs="Times New Roman"/>
+                <w:b/>
+                <w:sz w:val="20"/>
+              </w:rPr>
+              <w:t>Alejandro Sebastian Alfonso Huacasi</w:t>
+            </w:r>
+          </w:p>
+          <w:p>
+            <w:pPr>
+              <w:spacing w:before="0" w:after="20" w:line="240" w:lineRule="auto"/>
+              <w:ind w:firstLine="0" w:left="0"/>
+              <w:jc w:val="center"/>
+            </w:pPr>
+            <w:r>
+              <w:rPr>
+                <w:rFonts w:ascii="Times New Roman" w:hAnsi="Times New Roman" w:eastAsia="Times New Roman" w:cs="Times New Roman"/>
+                <w:i/>
+                <w:sz w:val="19"/>
+              </w:rPr>
+              <w:t>Escuela Profesional de Ingeniería de Sistemas</w:t>
+            </w:r>
+          </w:p>
+          <w:p>
+            <w:pPr>
+              <w:spacing w:before="0" w:after="20" w:line="240" w:lineRule="auto"/>
+              <w:ind w:firstLine="0" w:left="0"/>
+              <w:jc w:val="center"/>
+            </w:pPr>
+            <w:r>
+              <w:rPr>
+                <w:rFonts w:ascii="Times New Roman" w:hAnsi="Times New Roman" w:eastAsia="Times New Roman" w:cs="Times New Roman"/>
+                <w:i/>
+                <w:sz w:val="19"/>
+              </w:rPr>
+              <w:t>Universidad Nacional de San Agustín de Arequipa</w:t>
+            </w:r>
+          </w:p>
+          <w:p>
+            <w:pPr>
+              <w:spacing w:before="0" w:after="20" w:line="240" w:lineRule="auto"/>
+              <w:ind w:firstLine="0" w:left="0"/>
+              <w:jc w:val="center"/>
+            </w:pPr>
+            <w:r>
+              <w:rPr>
+                <w:rFonts w:ascii="Times New Roman" w:hAnsi="Times New Roman" w:eastAsia="Times New Roman" w:cs="Times New Roman"/>
+                <w:i w:val="0"/>
+                <w:sz w:val="19"/>
+              </w:rPr>
+              <w:t>Arequipa, Perú</w:t>
+            </w:r>
+          </w:p>
+          <w:p>
+            <w:pPr>
+              <w:spacing w:before="0" w:after="20" w:line="240" w:lineRule="auto"/>
+              <w:ind w:firstLine="0" w:left="0"/>
+              <w:jc w:val="center"/>
+            </w:pPr>
+            <w:r>
+              <w:rPr>
+                <w:rFonts w:ascii="Times New Roman" w:hAnsi="Times New Roman" w:eastAsia="Times New Roman" w:cs="Times New Roman"/>
+                <w:i w:val="0"/>
+                <w:sz w:val="19"/>
+              </w:rPr>
+              <w:t>aalfonso@unsa.edu.pe</w:t>
+            </w:r>
+          </w:p>
+        </w:tc>
+      </w:tr>
+    </w:tbl>
     <w:p>
       <w:pPr>
-        <w:spacing w:before="0" w:after="0" w:line="240" w:lineRule="auto"/>
-        <w:ind w:firstLine="0" w:left="0"/>
-        <w:jc w:val="center"/>
-      </w:pPr>
-      <w:r>
-        <w:rPr>
-          <w:rFonts w:ascii="Times New Roman" w:hAnsi="Times New Roman" w:eastAsia="Times New Roman" w:cs="Times New Roman"/>
-          <w:b w:val="0"/>
-          <w:i w:val="0"/>
-          <w:smallCaps w:val="0"/>
-          <w:sz w:val="20"/>
-        </w:rPr>
-        <w:t>Kevin A. Callo Quispe, Miembro, IEEE, Marco B. Marquez Herrera, Miembro, IEEE, y Sebastian C. Puma Apaza, Miembro del IEEE</w:t>
-      </w:r>
-    </w:p>
-    <w:p>
-      <w:pPr>
-        <w:spacing w:before="0" w:after="0" w:line="240" w:lineRule="auto"/>
-        <w:ind w:firstLine="0" w:left="0"/>
-        <w:jc w:val="center"/>
-      </w:pPr>
-      <w:r>
-        <w:rPr>
-          <w:rFonts w:ascii="Times New Roman" w:hAnsi="Times New Roman" w:eastAsia="Times New Roman" w:cs="Times New Roman"/>
-          <w:b w:val="0"/>
-          <w:i/>
-          <w:smallCaps w:val="0"/>
-          <w:sz w:val="20"/>
-        </w:rPr>
-        <w:t>Escuela Profesional de Ingeniería de Sistemas, Universidad Nacional de San Agustín de Arequipa, Arequipa, Perú</w:t>
-      </w:r>
-    </w:p>
-    <w:p>
-      <w:pPr>
-        <w:spacing w:before="0" w:after="0" w:line="240" w:lineRule="auto"/>
-        <w:ind w:firstLine="0" w:left="0"/>
-        <w:jc w:val="center"/>
-      </w:pPr>
-      <w:r>
-        <w:rPr>
-          <w:rFonts w:ascii="Times New Roman" w:hAnsi="Times New Roman" w:eastAsia="Times New Roman" w:cs="Times New Roman"/>
-          <w:b w:val="0"/>
-          <w:i w:val="0"/>
-          <w:smallCaps w:val="0"/>
-          <w:sz w:val="20"/>
-        </w:rPr>
-        <w:t>Correos: kcalloc@unsa.edu.pe, mmarquezhe@unsa.edu.pe, spumaap@unsa.edu.pe</w:t>
-      </w:r>
-    </w:p>
-    <w:p>
-      <w:pPr>
-        <w:spacing w:before="0" w:after="0" w:line="240" w:lineRule="auto"/>
-        <w:ind w:firstLine="0" w:left="0"/>
-        <w:jc w:val="center"/>
-      </w:pPr>
-      <w:r>
-        <w:rPr>
-          <w:rFonts w:ascii="Times New Roman" w:hAnsi="Times New Roman" w:eastAsia="Times New Roman" w:cs="Times New Roman"/>
-          <w:b w:val="0"/>
-          <w:i w:val="0"/>
-          <w:smallCaps w:val="0"/>
-          <w:sz w:val="20"/>
-        </w:rPr>
-        <w:t>ORCID: K. Callo Quispe (0009-0002-8412-1923), M. Marquez Herrera (0009-0007-4231-8891), S. Puma Apaza (0009-0005-1123-4567)</w:t>
-      </w:r>
-    </w:p>
-    <w:p>
-      <w:pPr>
-        <w:spacing w:before="0" w:after="120" w:line="240" w:lineRule="auto"/>
+        <w:spacing w:before="40" w:after="120" w:line="240" w:lineRule="auto"/>
         <w:ind w:firstLine="0" w:left="0"/>
         <w:jc w:val="center"/>
       </w:pPr>
@@ -7898,7 +8091,6 @@
     <w:p>
       <w:pPr>
         <w:keepNext/>
-        <w:pageBreakBefore/>
         <w:spacing w:before="160" w:after="80" w:line="240" w:lineRule="auto"/>
         <w:ind w:firstLine="0" w:left="0"/>
         <w:jc w:val="center"/>

</xml_diff>